<commit_message>
added a section in Project plan for Kanban
</commit_message>
<xml_diff>
--- a/Proposal working/Sam - Capstone Proposal.docx
+++ b/Proposal working/Sam - Capstone Proposal.docx
@@ -4058,7 +4058,6 @@
                               <w:szCs w:val="36"/>
                             </w:rPr>
                           </w:pPr>
-                          <w:proofErr w:type="spellStart"/>
                           <w:r>
                             <w:rPr>
                               <w:color w:val="404040" w:themeColor="text1" w:themeTint="BF"/>
@@ -4067,7 +4066,6 @@
                             </w:rPr>
                             <w:t>WelTec</w:t>
                           </w:r>
-                          <w:proofErr w:type="spellEnd"/>
                           <w:r>
                             <w:rPr>
                               <w:color w:val="404040" w:themeColor="text1" w:themeTint="BF"/>
@@ -4098,7 +4096,7 @@
                                         </pic:cNvPicPr>
                                       </pic:nvPicPr>
                                       <pic:blipFill>
-                                        <a:blip r:embed="rId9">
+                                        <a:blip r:embed="rId8">
                                           <a:extLst>
                                             <a:ext uri="{28A0092B-C50C-407E-A947-70E740481C1C}">
                                               <a14:useLocalDpi xmlns:a14="http://schemas.microsoft.com/office/drawing/2010/main" val="0"/>
@@ -6179,6 +6177,7 @@
     </w:p>
     <w:p>
       <w:pPr>
+        <w:jc w:val="both"/>
         <w:rPr>
           <w:lang w:val="en-NZ"/>
         </w:rPr>
@@ -6187,11 +6186,79 @@
         <w:rPr>
           <w:lang w:val="en-NZ"/>
         </w:rPr>
-        <w:t>The Methodology that we have selected is the CFTT Computer Forensic Tool Testing Process by NIST which is a functionality driven testing methodology that we believe reflects the requirements of our project because of the nature of the research driven outcomes, the process of which is as follows, Acquire tool to be tested, Review tool documentation, Select relevant test cases depending on features supported by tool, Develop Test strategy, Execute tests, Produce test report, Steering committee reviews test report, Vendor reviews test report, Post support software to web, DHS (our appropriate replacement of organisation) posts report to web. Using this testing process we believe that we can achieve the outcomes required of our project as it is a testing process specific to tool testing.</w:t>
+        <w:t xml:space="preserve">The Project Management methodology that we will be using is </w:t>
+      </w:r>
+      <w:r>
+        <w:rPr>
+          <w:lang w:val="en-NZ"/>
+        </w:rPr>
+        <w:t>for this project is Kanban. We have selected Kanban because it is one of the key Project Methodologies used in the current real-world workplaces. Kanban is a visual workflow management method that will allow us to better visualize the workload and optimise it according to demand. Kanban works best for us because it is familiar to us as we have used it in previous classes and can be integrated seamlessly into our project.</w:t>
       </w:r>
     </w:p>
     <w:p>
       <w:pPr>
+        <w:jc w:val="both"/>
+        <w:rPr>
+          <w:lang w:val="en-NZ"/>
+        </w:rPr>
+      </w:pPr>
+      <w:hyperlink r:id="rId9" w:history="1">
+        <w:r>
+          <w:rPr>
+            <w:rStyle w:val="Hyperlink"/>
+            <w:lang w:val="en-NZ"/>
+          </w:rPr>
+          <w:t>kanban</w:t>
+        </w:r>
+      </w:hyperlink>
+      <w:r>
+        <w:rPr>
+          <w:lang w:val="en-NZ"/>
+        </w:rPr>
+        <w:t xml:space="preserve"> </w:t>
+      </w:r>
+    </w:p>
+    <w:p>
+      <w:pPr>
+        <w:jc w:val="both"/>
+        <w:rPr>
+          <w:lang w:val="en-NZ"/>
+        </w:rPr>
+      </w:pPr>
+      <w:r>
+        <w:rPr>
+          <w:lang w:val="en-NZ"/>
+        </w:rPr>
+        <w:t xml:space="preserve">The </w:t>
+      </w:r>
+      <w:r>
+        <w:rPr>
+          <w:lang w:val="en-NZ"/>
+        </w:rPr>
+        <w:t xml:space="preserve">Testing </w:t>
+      </w:r>
+      <w:r>
+        <w:rPr>
+          <w:lang w:val="en-NZ"/>
+        </w:rPr>
+        <w:t xml:space="preserve">Methodology that we have selected is the CFTT Computer Forensic Tool Testing Process by NIST which is a functionality driven testing methodology that we believe reflects the requirements of our project because of the nature of the research driven outcomes, the process of which is as follows, Acquire tool to be tested, Review tool documentation, Select relevant test cases depending on features supported by tool, Develop Test strategy, Execute tests, Produce test report, Steering committee reviews test report, Vendor reviews test report, Post support software to web, DHS (our appropriate replacement of organisation) posts report to web. Using this testing </w:t>
+      </w:r>
+      <w:r>
+        <w:rPr>
+          <w:lang w:val="en-NZ"/>
+        </w:rPr>
+        <w:t>process,</w:t>
+      </w:r>
+      <w:r>
+        <w:rPr>
+          <w:lang w:val="en-NZ"/>
+        </w:rPr>
+        <w:t xml:space="preserve"> we believe that we can achieve the outcomes required of our project as it is a testing process specific to tool testing.</w:t>
+      </w:r>
+    </w:p>
+    <w:p>
+      <w:pPr>
+        <w:jc w:val="both"/>
         <w:rPr>
           <w:lang w:val="en-NZ"/>
         </w:rPr>
@@ -6202,21 +6269,7 @@
             <w:rStyle w:val="Hyperlink"/>
             <w:lang w:val="en-NZ"/>
           </w:rPr>
-          <w:t>NIST LI</w:t>
-        </w:r>
-        <w:r>
-          <w:rPr>
-            <w:rStyle w:val="Hyperlink"/>
-            <w:lang w:val="en-NZ"/>
-          </w:rPr>
-          <w:t>N</w:t>
-        </w:r>
-        <w:r>
-          <w:rPr>
-            <w:rStyle w:val="Hyperlink"/>
-            <w:lang w:val="en-NZ"/>
-          </w:rPr>
-          <w:t>K</w:t>
+          <w:t>NIST LINK</w:t>
         </w:r>
       </w:hyperlink>
       <w:r>
@@ -6229,6 +6282,7 @@
     <w:p>
       <w:pPr>
         <w:pStyle w:val="Heading2"/>
+        <w:jc w:val="both"/>
       </w:pPr>
       <w:bookmarkStart w:id="8" w:name="_Toc236403135"/>
       <w:r>
@@ -6359,6 +6413,7 @@
     <w:p>
       <w:pPr>
         <w:pStyle w:val="Heading2"/>
+        <w:jc w:val="both"/>
       </w:pPr>
       <w:bookmarkStart w:id="9" w:name="_Toc236403136"/>
       <w:r>
@@ -6368,6 +6423,7 @@
     </w:p>
     <w:p>
       <w:pPr>
+        <w:jc w:val="both"/>
         <w:rPr>
           <w:lang w:val="en-NZ"/>
         </w:rPr>

</xml_diff>